<commit_message>
Set Centrix workweek payday and payroll contact
</commit_message>
<xml_diff>
--- a/downloads/centrix-overtime-pay-policy-bilingual.docx
+++ b/downloads/centrix-overtime-pay-policy-bilingual.docx
@@ -236,9 +236,11 @@
     </w:tbl>
     <w:p>
       <w:r>
-        <w:t>Workweek begins (day/time) / Inicio de semana laboral (día/hora): _______________________</w:t>
+        <w:t>Workweek / Semana laboral: Sunday–Saturday / Domingo–sábado</w:t>
         <w:br/>
-        <w:t>Payday / Día de pago: ______________  Centrix payroll contact / Contacto de nómina: ______________</w:t>
+        <w:t>Payday / Día de pago: Friday / Viernes</w:t>
+        <w:br/>
+        <w:t>Centrix payroll contact / Contacto de nómina: Berlinda Diaz • 201-330-8881</w:t>
       </w:r>
     </w:p>
     <w:p>

</xml_diff>